<commit_message>
Updated Lab 2 worksheet
</commit_message>
<xml_diff>
--- a/lab2/CA_Lab_2_Worksheet (2).docx
+++ b/lab2/CA_Lab_2_Worksheet (2).docx
@@ -1667,6 +1667,76 @@
         <w:ind w:left="0" w:right="0"/>
         <w:jc w:val="left"/>
       </w:pPr>
+      <w:r>
+        <w:rPr>
+          <w:rFonts w:ascii="Aptos" w:hAnsi="Aptos" w:eastAsia="Aptos" w:cs="Aptos"/>
+          <w:noProof w:val="0"/>
+          <w:sz w:val="24"/>
+          <w:szCs w:val="24"/>
+          <w:lang w:val="en-US"/>
+        </w:rPr>
+        <w:t xml:space="preserve">Implements an if/else statement in RISC-V, where f = g + h if </w:t>
+      </w:r>
+      <w:r>
+        <w:rPr>
+          <w:rFonts w:ascii="Aptos" w:hAnsi="Aptos" w:eastAsia="Aptos" w:cs="Aptos"/>
+          <w:noProof w:val="0"/>
+          <w:sz w:val="24"/>
+          <w:szCs w:val="24"/>
+          <w:lang w:val="en-US"/>
+        </w:rPr>
+        <w:t>i</w:t>
+      </w:r>
+      <w:r>
+        <w:rPr>
+          <w:rFonts w:ascii="Aptos" w:hAnsi="Aptos" w:eastAsia="Aptos" w:cs="Aptos"/>
+          <w:noProof w:val="0"/>
+          <w:sz w:val="24"/>
+          <w:szCs w:val="24"/>
+          <w:lang w:val="en-US"/>
+        </w:rPr>
+        <w:t xml:space="preserve"> == j, otherwise f = g - h. It uses</w:t>
+      </w:r>
+      <w:r>
+        <w:rPr>
+          <w:rFonts w:ascii="Aptos" w:hAnsi="Aptos" w:eastAsia="Aptos" w:cs="Aptos"/>
+          <w:noProof w:val="0"/>
+          <w:sz w:val="24"/>
+          <w:szCs w:val="24"/>
+          <w:lang w:val="en-US"/>
+        </w:rPr>
+        <w:t xml:space="preserve"> bne </w:t>
+      </w:r>
+      <w:r>
+        <w:rPr>
+          <w:rFonts w:ascii="Aptos" w:hAnsi="Aptos" w:eastAsia="Aptos" w:cs="Aptos"/>
+          <w:noProof w:val="0"/>
+          <w:sz w:val="24"/>
+          <w:szCs w:val="24"/>
+          <w:lang w:val="en-US"/>
+        </w:rPr>
+        <w:t xml:space="preserve">to check whether </w:t>
+      </w:r>
+      <w:r>
+        <w:rPr>
+          <w:rFonts w:ascii="Aptos" w:hAnsi="Aptos" w:eastAsia="Aptos" w:cs="Aptos"/>
+          <w:noProof w:val="0"/>
+          <w:sz w:val="24"/>
+          <w:szCs w:val="24"/>
+          <w:lang w:val="en-US"/>
+        </w:rPr>
+        <w:t>i and j are unequal and branch to the else case, with an unconditional jump</w:t>
+      </w:r>
+      <w:r>
+        <w:rPr>
+          <w:rFonts w:ascii="Aptos" w:hAnsi="Aptos" w:eastAsia="Aptos" w:cs="Aptos"/>
+          <w:noProof w:val="0"/>
+          <w:sz w:val="24"/>
+          <w:szCs w:val="24"/>
+          <w:lang w:val="en-US"/>
+        </w:rPr>
+        <w:t xml:space="preserve"> used to skip over the else block when the if-condition is true mimicking how a compiled if/else avoids falling through both branches.</w:t>
+      </w:r>
     </w:p>
     <w:p>
       <w:pPr>
@@ -3899,6 +3969,116 @@
         <w:ind w:left="0" w:right="0"/>
         <w:jc w:val="left"/>
       </w:pPr>
+      <w:r>
+        <w:rPr>
+          <w:rFonts w:ascii="Aptos" w:hAnsi="Aptos" w:eastAsia="Aptos" w:cs="Aptos"/>
+          <w:noProof w:val="0"/>
+          <w:sz w:val="24"/>
+          <w:szCs w:val="24"/>
+          <w:lang w:val="en-US"/>
+        </w:rPr>
+        <w:t xml:space="preserve">Implements a while loop that searches an array for the first value different from a target </w:t>
+      </w:r>
+      <w:r>
+        <w:rPr>
+          <w:rFonts w:ascii="Consolas" w:hAnsi="Consolas" w:eastAsia="Consolas" w:cs="Consolas"/>
+          <w:noProof w:val="0"/>
+          <w:sz w:val="24"/>
+          <w:szCs w:val="24"/>
+          <w:lang w:val="en-US"/>
+        </w:rPr>
+        <w:t>k</w:t>
+      </w:r>
+      <w:r>
+        <w:rPr>
+          <w:rFonts w:ascii="Aptos" w:hAnsi="Aptos" w:eastAsia="Aptos" w:cs="Aptos"/>
+          <w:noProof w:val="0"/>
+          <w:sz w:val="24"/>
+          <w:szCs w:val="24"/>
+          <w:lang w:val="en-US"/>
+        </w:rPr>
+        <w:t xml:space="preserve">. It stores test values into memory, then loops through each element, computing its address, loading the value, and comparing it to </w:t>
+      </w:r>
+      <w:r>
+        <w:rPr>
+          <w:rFonts w:ascii="Consolas" w:hAnsi="Consolas" w:eastAsia="Consolas" w:cs="Consolas"/>
+          <w:noProof w:val="0"/>
+          <w:sz w:val="24"/>
+          <w:szCs w:val="24"/>
+          <w:lang w:val="en-US"/>
+        </w:rPr>
+        <w:t>k</w:t>
+      </w:r>
+      <w:r>
+        <w:rPr>
+          <w:rFonts w:ascii="Aptos" w:hAnsi="Aptos" w:eastAsia="Aptos" w:cs="Aptos"/>
+          <w:noProof w:val="0"/>
+          <w:sz w:val="24"/>
+          <w:szCs w:val="24"/>
+          <w:lang w:val="en-US"/>
+        </w:rPr>
+        <w:t xml:space="preserve">. The loop continues (using an unconditional jump back to </w:t>
+      </w:r>
+      <w:r>
+        <w:rPr>
+          <w:rFonts w:ascii="Consolas" w:hAnsi="Consolas" w:eastAsia="Consolas" w:cs="Consolas"/>
+          <w:noProof w:val="0"/>
+          <w:sz w:val="24"/>
+          <w:szCs w:val="24"/>
+          <w:lang w:val="en-US"/>
+        </w:rPr>
+        <w:t>Loop</w:t>
+      </w:r>
+      <w:r>
+        <w:rPr>
+          <w:rFonts w:ascii="Aptos" w:hAnsi="Aptos" w:eastAsia="Aptos" w:cs="Aptos"/>
+          <w:noProof w:val="0"/>
+          <w:sz w:val="24"/>
+          <w:szCs w:val="24"/>
+          <w:lang w:val="en-US"/>
+        </w:rPr>
+        <w:t xml:space="preserve">) as long as the </w:t>
+      </w:r>
+      <w:r>
+        <w:rPr>
+          <w:rFonts w:ascii="Aptos" w:hAnsi="Aptos" w:eastAsia="Aptos" w:cs="Aptos"/>
+          <w:noProof w:val="0"/>
+          <w:sz w:val="24"/>
+          <w:szCs w:val="24"/>
+          <w:lang w:val="en-US"/>
+        </w:rPr>
+        <w:t>values match, and</w:t>
+      </w:r>
+      <w:r>
+        <w:rPr>
+          <w:rFonts w:ascii="Aptos" w:hAnsi="Aptos" w:eastAsia="Aptos" w:cs="Aptos"/>
+          <w:noProof w:val="0"/>
+          <w:sz w:val="24"/>
+          <w:szCs w:val="24"/>
+          <w:lang w:val="en-US"/>
+        </w:rPr>
+        <w:t xml:space="preserve"> exits as soon as it finds one that </w:t>
+      </w:r>
+      <w:r>
+        <w:rPr>
+          <w:rFonts w:ascii="Aptos" w:hAnsi="Aptos" w:eastAsia="Aptos" w:cs="Aptos"/>
+          <w:noProof w:val="0"/>
+          <w:sz w:val="24"/>
+          <w:szCs w:val="24"/>
+          <w:lang w:val="en-US"/>
+        </w:rPr>
+        <w:t>doesn't</w:t>
+      </w:r>
+      <w:r>
+        <w:rPr>
+          <w:rFonts w:ascii="Aptos" w:hAnsi="Aptos" w:eastAsia="Aptos" w:cs="Aptos"/>
+          <w:noProof w:val="0"/>
+          <w:sz w:val="24"/>
+          <w:szCs w:val="24"/>
+          <w:lang w:val="en-US"/>
+        </w:rPr>
+        <w:t>, leaving the index of that "odd" value in the loop counter register.</w:t>
+      </w:r>
     </w:p>
     <w:p>
       <w:pPr>
@@ -8772,6 +8952,180 @@
         <w:spacing w:before="0" w:beforeAutospacing="off" w:after="0" w:afterAutospacing="off" w:line="240" w:lineRule="auto"/>
         <w:ind w:left="0" w:right="0"/>
         <w:jc w:val="left"/>
+      </w:pPr>
+      <w:r>
+        <w:rPr>
+          <w:rFonts w:ascii="Times New Roman" w:hAnsi="Times New Roman" w:eastAsia="Times New Roman" w:cs="Times New Roman"/>
+          <w:noProof w:val="0"/>
+          <w:sz w:val="22"/>
+          <w:szCs w:val="22"/>
+          <w:lang w:val="en-US"/>
+        </w:rPr>
+        <w:t xml:space="preserve">Implements a switch statement in RISC-V, comparing variable </w:t>
+      </w:r>
+      <w:r>
+        <w:rPr>
+          <w:rFonts w:ascii="Consolas" w:hAnsi="Consolas" w:eastAsia="Consolas" w:cs="Consolas"/>
+          <w:noProof w:val="0"/>
+          <w:sz w:val="22"/>
+          <w:szCs w:val="22"/>
+          <w:lang w:val="en-US"/>
+        </w:rPr>
+        <w:t>x</w:t>
+      </w:r>
+      <w:r>
+        <w:rPr>
+          <w:rFonts w:ascii="Times New Roman" w:hAnsi="Times New Roman" w:eastAsia="Times New Roman" w:cs="Times New Roman"/>
+          <w:noProof w:val="0"/>
+          <w:sz w:val="22"/>
+          <w:szCs w:val="22"/>
+          <w:lang w:val="en-US"/>
+        </w:rPr>
+        <w:t xml:space="preserve"> against each </w:t>
+      </w:r>
+      <w:r>
+        <w:rPr>
+          <w:rFonts w:ascii="Times New Roman" w:hAnsi="Times New Roman" w:eastAsia="Times New Roman" w:cs="Times New Roman"/>
+          <w:noProof w:val="0"/>
+          <w:sz w:val="22"/>
+          <w:szCs w:val="22"/>
+          <w:lang w:val="en-US"/>
+        </w:rPr>
+        <w:t>possible case</w:t>
+      </w:r>
+      <w:r>
+        <w:rPr>
+          <w:rFonts w:ascii="Times New Roman" w:hAnsi="Times New Roman" w:eastAsia="Times New Roman" w:cs="Times New Roman"/>
+          <w:noProof w:val="0"/>
+          <w:sz w:val="22"/>
+          <w:szCs w:val="22"/>
+          <w:lang w:val="en-US"/>
+        </w:rPr>
+        <w:t xml:space="preserve"> value (1 through 4) using a chain of</w:t>
+      </w:r>
+      <w:r>
+        <w:rPr>
+          <w:rFonts w:ascii="Times New Roman" w:hAnsi="Times New Roman" w:eastAsia="Times New Roman" w:cs="Times New Roman"/>
+          <w:noProof w:val="0"/>
+          <w:sz w:val="22"/>
+          <w:szCs w:val="22"/>
+          <w:lang w:val="en-US"/>
+        </w:rPr>
+        <w:t xml:space="preserve"> </w:t>
+      </w:r>
+      <w:r>
+        <w:rPr>
+          <w:rFonts w:ascii="Times New Roman" w:hAnsi="Times New Roman" w:eastAsia="Times New Roman" w:cs="Times New Roman"/>
+          <w:noProof w:val="0"/>
+          <w:sz w:val="22"/>
+          <w:szCs w:val="22"/>
+          <w:lang w:val="en-US"/>
+        </w:rPr>
+        <w:t>beq</w:t>
+      </w:r>
+      <w:r>
+        <w:rPr>
+          <w:rFonts w:ascii="Times New Roman" w:hAnsi="Times New Roman" w:eastAsia="Times New Roman" w:cs="Times New Roman"/>
+          <w:noProof w:val="0"/>
+          <w:sz w:val="22"/>
+          <w:szCs w:val="22"/>
+          <w:lang w:val="en-US"/>
+        </w:rPr>
+        <w:t xml:space="preserve"> instructions, and falling through to a default case if none </w:t>
+      </w:r>
+      <w:r>
+        <w:rPr>
+          <w:rFonts w:ascii="Times New Roman" w:hAnsi="Times New Roman" w:eastAsia="Times New Roman" w:cs="Times New Roman"/>
+          <w:noProof w:val="0"/>
+          <w:sz w:val="22"/>
+          <w:szCs w:val="22"/>
+          <w:lang w:val="en-US"/>
+        </w:rPr>
+        <w:t>match</w:t>
+      </w:r>
+      <w:r>
+        <w:rPr>
+          <w:rFonts w:ascii="Times New Roman" w:hAnsi="Times New Roman" w:eastAsia="Times New Roman" w:cs="Times New Roman"/>
+          <w:noProof w:val="0"/>
+          <w:sz w:val="22"/>
+          <w:szCs w:val="22"/>
+          <w:lang w:val="en-US"/>
+        </w:rPr>
+        <w:t>. Each case performs a different arithmetic operation on</w:t>
+      </w:r>
+      <w:r>
+        <w:rPr>
+          <w:rFonts w:ascii="Times New Roman" w:hAnsi="Times New Roman" w:eastAsia="Times New Roman" w:cs="Times New Roman"/>
+          <w:noProof w:val="0"/>
+          <w:sz w:val="22"/>
+          <w:szCs w:val="22"/>
+          <w:lang w:val="en-US"/>
+        </w:rPr>
+        <w:t xml:space="preserve"> b and c </w:t>
+      </w:r>
+      <w:r>
+        <w:rPr>
+          <w:rFonts w:ascii="Times New Roman" w:hAnsi="Times New Roman" w:eastAsia="Times New Roman" w:cs="Times New Roman"/>
+          <w:noProof w:val="0"/>
+          <w:sz w:val="22"/>
+          <w:szCs w:val="22"/>
+          <w:lang w:val="en-US"/>
+        </w:rPr>
+        <w:t xml:space="preserve">to compute </w:t>
+      </w:r>
+      <w:r>
+        <w:rPr>
+          <w:rFonts w:ascii="Times New Roman" w:hAnsi="Times New Roman" w:eastAsia="Times New Roman" w:cs="Times New Roman"/>
+          <w:noProof w:val="0"/>
+          <w:sz w:val="22"/>
+          <w:szCs w:val="22"/>
+          <w:lang w:val="en-US"/>
+        </w:rPr>
+        <w:t xml:space="preserve">a </w:t>
+      </w:r>
+      <w:r>
+        <w:rPr>
+          <w:rFonts w:ascii="Times New Roman" w:hAnsi="Times New Roman" w:eastAsia="Times New Roman" w:cs="Times New Roman"/>
+          <w:noProof w:val="0"/>
+          <w:sz w:val="22"/>
+          <w:szCs w:val="22"/>
+          <w:lang w:val="en-US"/>
+        </w:rPr>
+        <w:t xml:space="preserve">(addition, subtraction, multiply-by-2, divide-by-2), with unconditional jumps ensuring only one </w:t>
+      </w:r>
+      <w:r>
+        <w:rPr>
+          <w:rFonts w:ascii="Times New Roman" w:hAnsi="Times New Roman" w:eastAsia="Times New Roman" w:cs="Times New Roman"/>
+          <w:noProof w:val="0"/>
+          <w:sz w:val="22"/>
+          <w:szCs w:val="22"/>
+          <w:lang w:val="en-US"/>
+        </w:rPr>
+        <w:t>case's</w:t>
+      </w:r>
+      <w:r>
+        <w:rPr>
+          <w:rFonts w:ascii="Times New Roman" w:hAnsi="Times New Roman" w:eastAsia="Times New Roman" w:cs="Times New Roman"/>
+          <w:noProof w:val="0"/>
+          <w:sz w:val="22"/>
+          <w:szCs w:val="22"/>
+          <w:lang w:val="en-US"/>
+        </w:rPr>
+        <w:t xml:space="preserve"> result is kept before exiting.</w:t>
+      </w:r>
+    </w:p>
+    <w:p>
+      <w:pPr>
+        <w:pStyle w:val="Normal"/>
+        <w:suppressLineNumbers w:val="0"/>
+        <w:tabs>
+          <w:tab w:val="center" w:leader="none" w:pos="4680"/>
+          <w:tab w:val="right" w:leader="none" w:pos="9360"/>
+        </w:tabs>
+        <w:bidi w:val="0"/>
+        <w:spacing w:before="0" w:beforeAutospacing="off" w:after="0" w:afterAutospacing="off" w:line="240" w:lineRule="auto"/>
+        <w:ind w:left="0" w:right="0"/>
+        <w:jc w:val="left"/>
         <w:rPr>
           <w:rFonts w:ascii="Times New Roman" w:hAnsi="Times New Roman" w:eastAsia="Times New Roman" w:cs="Times New Roman"/>
           <w:b w:val="0"/>
@@ -8920,35 +9274,6 @@
         <w:jc w:val="left"/>
         <w:rPr>
           <w:rFonts w:ascii="Times New Roman" w:hAnsi="Times New Roman" w:eastAsia="Times New Roman" w:cs="Times New Roman"/>
-          <w:b w:val="1"/>
-          <w:bCs w:val="1"/>
-          <w:i w:val="0"/>
-          <w:iCs w:val="0"/>
-          <w:caps w:val="0"/>
-          <w:smallCaps w:val="0"/>
-          <w:noProof w:val="0"/>
-          <w:color w:val="000000" w:themeColor="text1" w:themeTint="FF" w:themeShade="FF"/>
-          <w:sz w:val="28"/>
-          <w:szCs w:val="28"/>
-          <w:u w:val="single"/>
-          <w:lang w:val="en-US"/>
-        </w:rPr>
-      </w:pPr>
-    </w:p>
-    <w:p>
-      <w:pPr>
-        <w:pStyle w:val="Normal"/>
-        <w:suppressLineNumbers w:val="0"/>
-        <w:tabs>
-          <w:tab w:val="center" w:leader="none" w:pos="4680"/>
-          <w:tab w:val="right" w:leader="none" w:pos="9360"/>
-        </w:tabs>
-        <w:bidi w:val="0"/>
-        <w:spacing w:before="0" w:beforeAutospacing="off" w:after="0" w:afterAutospacing="off" w:line="240" w:lineRule="auto"/>
-        <w:ind w:left="0" w:right="0"/>
-        <w:jc w:val="left"/>
-        <w:rPr>
-          <w:rFonts w:ascii="Times New Roman" w:hAnsi="Times New Roman" w:eastAsia="Times New Roman" w:cs="Times New Roman"/>
           <w:b w:val="0"/>
           <w:bCs w:val="0"/>
           <w:i w:val="0"/>
@@ -9682,45 +10007,6 @@
         </w:drawing>
       </w:r>
     </w:p>
-    <w:p w14:noSpellErr="1">
-      <w:pPr>
-        <w:pStyle w:val="Normal"/>
-        <w:tabs>
-          <w:tab w:val="center" w:leader="none" w:pos="4680"/>
-          <w:tab w:val="right" w:leader="none" w:pos="9360"/>
-        </w:tabs>
-        <w:bidi w:val="0"/>
-        <w:spacing w:before="0" w:beforeAutospacing="off" w:after="0" w:afterAutospacing="off" w:line="240" w:lineRule="auto"/>
-        <w:ind w:left="0" w:right="0"/>
-        <w:jc w:val="left"/>
-      </w:pPr>
-    </w:p>
-    <w:p>
-      <w:pPr>
-        <w:pStyle w:val="Normal"/>
-        <w:tabs>
-          <w:tab w:val="center" w:leader="none" w:pos="4680"/>
-          <w:tab w:val="right" w:leader="none" w:pos="9360"/>
-        </w:tabs>
-        <w:bidi w:val="0"/>
-        <w:spacing w:before="0" w:beforeAutospacing="off" w:after="0" w:afterAutospacing="off" w:line="240" w:lineRule="auto"/>
-        <w:ind w:left="0" w:right="0"/>
-        <w:jc w:val="left"/>
-      </w:pPr>
-    </w:p>
-    <w:p>
-      <w:pPr>
-        <w:pStyle w:val="Normal"/>
-        <w:tabs>
-          <w:tab w:val="center" w:leader="none" w:pos="4680"/>
-          <w:tab w:val="right" w:leader="none" w:pos="9360"/>
-        </w:tabs>
-        <w:bidi w:val="0"/>
-        <w:spacing w:before="0" w:beforeAutospacing="off" w:after="0" w:afterAutospacing="off" w:line="240" w:lineRule="auto"/>
-        <w:ind w:left="0" w:right="0"/>
-        <w:jc w:val="left"/>
-      </w:pPr>
-    </w:p>
     <w:p>
       <w:pPr>
         <w:pStyle w:val="Normal"/>
@@ -12196,21 +12482,117 @@
         <w:spacing w:before="0" w:beforeAutospacing="off" w:after="0" w:afterAutospacing="off" w:line="240" w:lineRule="auto"/>
         <w:ind w:left="0" w:right="0"/>
         <w:jc w:val="left"/>
+      </w:pPr>
+      <w:r>
         <w:rPr>
           <w:rFonts w:ascii="Times New Roman" w:hAnsi="Times New Roman" w:eastAsia="Times New Roman" w:cs="Times New Roman"/>
-          <w:b w:val="0"/>
-          <w:bCs w:val="0"/>
-          <w:i w:val="0"/>
-          <w:iCs w:val="0"/>
-          <w:caps w:val="0"/>
-          <w:smallCaps w:val="0"/>
-          <w:noProof w:val="0"/>
-          <w:color w:val="000000" w:themeColor="text1" w:themeTint="FF" w:themeShade="FF"/>
+          <w:noProof w:val="0"/>
           <w:sz w:val="22"/>
           <w:szCs w:val="22"/>
           <w:lang w:val="en-US"/>
         </w:rPr>
-      </w:pPr>
+        <w:t>Implements two sequential for-loops over a 10-element integer array. The first loop populates a[</w:t>
+      </w:r>
+      <w:r>
+        <w:rPr>
+          <w:rFonts w:ascii="Times New Roman" w:hAnsi="Times New Roman" w:eastAsia="Times New Roman" w:cs="Times New Roman"/>
+          <w:noProof w:val="0"/>
+          <w:sz w:val="22"/>
+          <w:szCs w:val="22"/>
+          <w:lang w:val="en-US"/>
+        </w:rPr>
+        <w:t>i</w:t>
+      </w:r>
+      <w:r>
+        <w:rPr>
+          <w:rFonts w:ascii="Times New Roman" w:hAnsi="Times New Roman" w:eastAsia="Times New Roman" w:cs="Times New Roman"/>
+          <w:noProof w:val="0"/>
+          <w:sz w:val="22"/>
+          <w:szCs w:val="22"/>
+          <w:lang w:val="en-US"/>
+        </w:rPr>
+        <w:t xml:space="preserve">] = </w:t>
+      </w:r>
+      <w:r>
+        <w:rPr>
+          <w:rFonts w:ascii="Times New Roman" w:hAnsi="Times New Roman" w:eastAsia="Times New Roman" w:cs="Times New Roman"/>
+          <w:noProof w:val="0"/>
+          <w:sz w:val="22"/>
+          <w:szCs w:val="22"/>
+          <w:lang w:val="en-US"/>
+        </w:rPr>
+        <w:t>i</w:t>
+      </w:r>
+      <w:r>
+        <w:rPr>
+          <w:rFonts w:ascii="Consolas" w:hAnsi="Consolas" w:eastAsia="Consolas" w:cs="Consolas"/>
+          <w:noProof w:val="0"/>
+          <w:sz w:val="22"/>
+          <w:szCs w:val="22"/>
+          <w:lang w:val="en-US"/>
+        </w:rPr>
+        <w:t xml:space="preserve"> </w:t>
+      </w:r>
+      <w:r>
+        <w:rPr>
+          <w:rFonts w:ascii="Times New Roman" w:hAnsi="Times New Roman" w:eastAsia="Times New Roman" w:cs="Times New Roman"/>
+          <w:noProof w:val="0"/>
+          <w:sz w:val="22"/>
+          <w:szCs w:val="22"/>
+          <w:lang w:val="en-US"/>
+        </w:rPr>
+        <w:t xml:space="preserve">for each index, storing values directly into memory. The second loop then reads each element back with </w:t>
+      </w:r>
+      <w:r>
+        <w:rPr>
+          <w:rFonts w:ascii="Times New Roman" w:hAnsi="Times New Roman" w:eastAsia="Times New Roman" w:cs="Times New Roman"/>
+          <w:noProof w:val="0"/>
+          <w:sz w:val="22"/>
+          <w:szCs w:val="22"/>
+          <w:lang w:val="en-US"/>
+        </w:rPr>
+        <w:t>lw</w:t>
+      </w:r>
+      <w:r>
+        <w:rPr>
+          <w:rFonts w:ascii="Consolas" w:hAnsi="Consolas" w:eastAsia="Consolas" w:cs="Consolas"/>
+          <w:noProof w:val="0"/>
+          <w:sz w:val="22"/>
+          <w:szCs w:val="22"/>
+          <w:lang w:val="en-US"/>
+        </w:rPr>
+        <w:t xml:space="preserve"> </w:t>
+      </w:r>
+      <w:r>
+        <w:rPr>
+          <w:rFonts w:ascii="Times New Roman" w:hAnsi="Times New Roman" w:eastAsia="Times New Roman" w:cs="Times New Roman"/>
+          <w:noProof w:val="0"/>
+          <w:sz w:val="22"/>
+          <w:szCs w:val="22"/>
+          <w:lang w:val="en-US"/>
+        </w:rPr>
+        <w:t xml:space="preserve">and accumulates them into a running total (sum), effectively computing the sum of 0 through 9 using array-based memory access instead of direct </w:t>
+      </w:r>
+      <w:r>
+        <w:rPr>
+          <w:rFonts w:ascii="Times New Roman" w:hAnsi="Times New Roman" w:eastAsia="Times New Roman" w:cs="Times New Roman"/>
+          <w:noProof w:val="0"/>
+          <w:sz w:val="22"/>
+          <w:szCs w:val="22"/>
+          <w:lang w:val="en-US"/>
+        </w:rPr>
+        <w:t>register</w:t>
+      </w:r>
+      <w:r>
+        <w:rPr>
+          <w:rFonts w:ascii="Times New Roman" w:hAnsi="Times New Roman" w:eastAsia="Times New Roman" w:cs="Times New Roman"/>
+          <w:noProof w:val="0"/>
+          <w:sz w:val="22"/>
+          <w:szCs w:val="22"/>
+          <w:lang w:val="en-US"/>
+        </w:rPr>
+        <w:t xml:space="preserve"> arithmetic.</w:t>
+      </w:r>
     </w:p>
     <w:p>
       <w:pPr>
@@ -15969,143 +16351,297 @@
     </w:p>
     <w:p>
       <w:pPr>
-        <w:pStyle w:val="Normal"/>
-        <w:suppressLineNumbers w:val="0"/>
-        <w:tabs>
-          <w:tab w:val="center" w:leader="none" w:pos="4680"/>
-          <w:tab w:val="right" w:leader="none" w:pos="9360"/>
-        </w:tabs>
-        <w:bidi w:val="0"/>
-        <w:spacing w:before="0" w:beforeAutospacing="off" w:after="0" w:afterAutospacing="off" w:line="240" w:lineRule="auto"/>
-        <w:ind w:left="0" w:right="0"/>
-        <w:jc w:val="left"/>
+        <w:suppressLineNumbers w:val="0"/>
+        <w:shd w:val="clear" w:color="auto" w:fill="121314"/>
+        <w:bidi w:val="0"/>
+        <w:spacing w:before="0" w:beforeAutospacing="off" w:after="0" w:afterAutospacing="off" w:line="285" w:lineRule="auto"/>
+        <w:ind/>
+        <w:jc w:val="left"/>
+        <w:rPr>
+          <w:rFonts w:ascii="Consolas" w:hAnsi="Consolas" w:eastAsia="Consolas" w:cs="Consolas"/>
+          <w:b w:val="0"/>
+          <w:bCs w:val="0"/>
+          <w:noProof w:val="0"/>
+          <w:color w:val="BBBEBF"/>
+          <w:sz w:val="21"/>
+          <w:szCs w:val="21"/>
+          <w:lang w:val="en-US"/>
+        </w:rPr>
+      </w:pPr>
+    </w:p>
+    <w:p>
+      <w:pPr>
+        <w:pStyle w:val="Normal"/>
+        <w:suppressLineNumbers w:val="0"/>
+        <w:tabs>
+          <w:tab w:val="center" w:leader="none" w:pos="4680"/>
+          <w:tab w:val="right" w:leader="none" w:pos="9360"/>
+        </w:tabs>
+        <w:bidi w:val="0"/>
+        <w:spacing w:before="0" w:beforeAutospacing="off" w:after="0" w:afterAutospacing="off" w:line="240" w:lineRule="auto"/>
+        <w:ind w:left="0" w:right="0"/>
+        <w:jc w:val="left"/>
+      </w:pPr>
+      <w:r>
         <w:rPr>
           <w:rFonts w:ascii="Times New Roman" w:hAnsi="Times New Roman" w:eastAsia="Times New Roman" w:cs="Times New Roman"/>
-          <w:b w:val="0"/>
-          <w:bCs w:val="0"/>
-          <w:i w:val="0"/>
-          <w:iCs w:val="0"/>
-          <w:caps w:val="0"/>
-          <w:smallCaps w:val="0"/>
-          <w:noProof w:val="0"/>
-          <w:color w:val="000000" w:themeColor="text1" w:themeTint="FF" w:themeShade="FF"/>
+          <w:noProof w:val="0"/>
           <w:sz w:val="22"/>
           <w:szCs w:val="22"/>
           <w:lang w:val="en-US"/>
         </w:rPr>
-      </w:pPr>
-    </w:p>
-    <w:p>
-      <w:pPr>
-        <w:pStyle w:val="Normal"/>
-        <w:suppressLineNumbers w:val="0"/>
-        <w:tabs>
-          <w:tab w:val="center" w:leader="none" w:pos="4680"/>
-          <w:tab w:val="right" w:leader="none" w:pos="9360"/>
-        </w:tabs>
-        <w:bidi w:val="0"/>
-        <w:spacing w:before="0" w:beforeAutospacing="off" w:after="0" w:afterAutospacing="off" w:line="240" w:lineRule="auto"/>
-        <w:ind w:left="0" w:right="0"/>
-        <w:jc w:val="left"/>
+        <w:t>Implements a nested for-loop that computes</w:t>
+      </w:r>
+      <w:r>
         <w:rPr>
           <w:rFonts w:ascii="Times New Roman" w:hAnsi="Times New Roman" w:eastAsia="Times New Roman" w:cs="Times New Roman"/>
-          <w:b w:val="0"/>
-          <w:bCs w:val="0"/>
-          <w:i w:val="0"/>
-          <w:iCs w:val="0"/>
-          <w:caps w:val="0"/>
-          <w:smallCaps w:val="0"/>
-          <w:noProof w:val="0"/>
-          <w:color w:val="000000" w:themeColor="text1" w:themeTint="FF" w:themeShade="FF"/>
+          <w:noProof w:val="0"/>
           <w:sz w:val="22"/>
           <w:szCs w:val="22"/>
           <w:lang w:val="en-US"/>
         </w:rPr>
-      </w:pPr>
-    </w:p>
-    <w:p>
-      <w:pPr>
-        <w:pStyle w:val="Normal"/>
-        <w:suppressLineNumbers w:val="0"/>
-        <w:tabs>
-          <w:tab w:val="center" w:leader="none" w:pos="4680"/>
-          <w:tab w:val="right" w:leader="none" w:pos="9360"/>
-        </w:tabs>
-        <w:bidi w:val="0"/>
-        <w:spacing w:before="0" w:beforeAutospacing="off" w:after="0" w:afterAutospacing="off" w:line="240" w:lineRule="auto"/>
-        <w:ind w:left="0" w:right="0"/>
-        <w:jc w:val="left"/>
+        <w:t xml:space="preserve"> D[4*j]</w:t>
+      </w:r>
+      <w:r>
         <w:rPr>
           <w:rFonts w:ascii="Times New Roman" w:hAnsi="Times New Roman" w:eastAsia="Times New Roman" w:cs="Times New Roman"/>
-          <w:b w:val="0"/>
-          <w:bCs w:val="0"/>
-          <w:i w:val="0"/>
-          <w:iCs w:val="0"/>
-          <w:caps w:val="0"/>
-          <w:smallCaps w:val="0"/>
-          <w:noProof w:val="0"/>
-          <w:color w:val="000000" w:themeColor="text1" w:themeTint="FF" w:themeShade="FF"/>
+          <w:noProof w:val="0"/>
           <w:sz w:val="22"/>
           <w:szCs w:val="22"/>
           <w:lang w:val="en-US"/>
         </w:rPr>
-      </w:pPr>
-    </w:p>
-    <w:p>
-      <w:pPr>
-        <w:pStyle w:val="Normal"/>
-        <w:suppressLineNumbers w:val="0"/>
-        <w:tabs>
-          <w:tab w:val="center" w:leader="none" w:pos="4680"/>
-          <w:tab w:val="right" w:leader="none" w:pos="9360"/>
-        </w:tabs>
-        <w:bidi w:val="0"/>
-        <w:spacing w:before="0" w:beforeAutospacing="off" w:after="0" w:afterAutospacing="off" w:line="240" w:lineRule="auto"/>
-        <w:ind w:left="0" w:right="0"/>
-        <w:jc w:val="left"/>
+        <w:t xml:space="preserve"> = </w:t>
+      </w:r>
+      <w:r>
         <w:rPr>
           <w:rFonts w:ascii="Times New Roman" w:hAnsi="Times New Roman" w:eastAsia="Times New Roman" w:cs="Times New Roman"/>
-          <w:b w:val="0"/>
-          <w:bCs w:val="0"/>
-          <w:i w:val="0"/>
-          <w:iCs w:val="0"/>
-          <w:caps w:val="0"/>
-          <w:smallCaps w:val="0"/>
-          <w:noProof w:val="0"/>
-          <w:color w:val="000000" w:themeColor="text1" w:themeTint="FF" w:themeShade="FF"/>
+          <w:noProof w:val="0"/>
           <w:sz w:val="22"/>
           <w:szCs w:val="22"/>
           <w:lang w:val="en-US"/>
         </w:rPr>
-      </w:pPr>
-    </w:p>
-    <w:p>
-      <w:pPr>
-        <w:pStyle w:val="Normal"/>
-        <w:suppressLineNumbers w:val="0"/>
-        <w:tabs>
-          <w:tab w:val="center" w:leader="none" w:pos="4680"/>
-          <w:tab w:val="right" w:leader="none" w:pos="9360"/>
-        </w:tabs>
-        <w:bidi w:val="0"/>
-        <w:spacing w:before="0" w:beforeAutospacing="off" w:after="0" w:afterAutospacing="off" w:line="240" w:lineRule="auto"/>
-        <w:ind w:left="0" w:right="0"/>
-        <w:jc w:val="left"/>
+        <w:t>i+j</w:t>
+      </w:r>
+      <w:r>
         <w:rPr>
           <w:rFonts w:ascii="Times New Roman" w:hAnsi="Times New Roman" w:eastAsia="Times New Roman" w:cs="Times New Roman"/>
-          <w:b w:val="0"/>
-          <w:bCs w:val="0"/>
-          <w:i w:val="0"/>
-          <w:iCs w:val="0"/>
-          <w:caps w:val="0"/>
-          <w:smallCaps w:val="0"/>
-          <w:noProof w:val="0"/>
-          <w:color w:val="000000" w:themeColor="text1" w:themeTint="FF" w:themeShade="FF"/>
+          <w:noProof w:val="0"/>
           <w:sz w:val="22"/>
           <w:szCs w:val="22"/>
           <w:lang w:val="en-US"/>
         </w:rPr>
-      </w:pPr>
+        <w:t xml:space="preserve"> </w:t>
+      </w:r>
+      <w:r>
+        <w:rPr>
+          <w:rFonts w:ascii="Times New Roman" w:hAnsi="Times New Roman" w:eastAsia="Times New Roman" w:cs="Times New Roman"/>
+          <w:noProof w:val="0"/>
+          <w:sz w:val="22"/>
+          <w:szCs w:val="22"/>
+          <w:lang w:val="en-US"/>
+        </w:rPr>
+        <w:t>for a 10×10 range of</w:t>
+      </w:r>
+      <w:r>
+        <w:rPr>
+          <w:rFonts w:ascii="Times New Roman" w:hAnsi="Times New Roman" w:eastAsia="Times New Roman" w:cs="Times New Roman"/>
+          <w:noProof w:val="0"/>
+          <w:sz w:val="22"/>
+          <w:szCs w:val="22"/>
+          <w:lang w:val="en-US"/>
+        </w:rPr>
+        <w:t xml:space="preserve"> i and j </w:t>
+      </w:r>
+      <w:r>
+        <w:rPr>
+          <w:rFonts w:ascii="Times New Roman" w:hAnsi="Times New Roman" w:eastAsia="Times New Roman" w:cs="Times New Roman"/>
+          <w:noProof w:val="0"/>
+          <w:sz w:val="22"/>
+          <w:szCs w:val="22"/>
+          <w:lang w:val="en-US"/>
+        </w:rPr>
+        <w:t>values,</w:t>
+      </w:r>
+      <w:r>
+        <w:rPr>
+          <w:rFonts w:ascii="Times New Roman" w:hAnsi="Times New Roman" w:eastAsia="Times New Roman" w:cs="Times New Roman"/>
+          <w:noProof w:val="0"/>
+          <w:sz w:val="22"/>
+          <w:szCs w:val="22"/>
+          <w:lang w:val="en-US"/>
+        </w:rPr>
+        <w:t xml:space="preserve"> writing results into a word array in memory. The inner loop resets</w:t>
+      </w:r>
+      <w:r>
+        <w:rPr>
+          <w:rFonts w:ascii="Times New Roman" w:hAnsi="Times New Roman" w:eastAsia="Times New Roman" w:cs="Times New Roman"/>
+          <w:noProof w:val="0"/>
+          <w:sz w:val="22"/>
+          <w:szCs w:val="22"/>
+          <w:lang w:val="en-US"/>
+        </w:rPr>
+        <w:t xml:space="preserve"> j</w:t>
+      </w:r>
+      <w:r>
+        <w:rPr>
+          <w:rFonts w:ascii="Consolas" w:hAnsi="Consolas" w:eastAsia="Consolas" w:cs="Consolas"/>
+          <w:noProof w:val="0"/>
+          <w:sz w:val="22"/>
+          <w:szCs w:val="22"/>
+          <w:lang w:val="en-US"/>
+        </w:rPr>
+        <w:t xml:space="preserve"> </w:t>
+      </w:r>
+      <w:r>
+        <w:rPr>
+          <w:rFonts w:ascii="Times New Roman" w:hAnsi="Times New Roman" w:eastAsia="Times New Roman" w:cs="Times New Roman"/>
+          <w:noProof w:val="0"/>
+          <w:sz w:val="22"/>
+          <w:szCs w:val="22"/>
+          <w:lang w:val="en-US"/>
+        </w:rPr>
+        <w:t>to 0 and iterates through all</w:t>
+      </w:r>
+      <w:r>
+        <w:rPr>
+          <w:rFonts w:ascii="Times New Roman" w:hAnsi="Times New Roman" w:eastAsia="Times New Roman" w:cs="Times New Roman"/>
+          <w:noProof w:val="0"/>
+          <w:sz w:val="22"/>
+          <w:szCs w:val="22"/>
+          <w:lang w:val="en-US"/>
+        </w:rPr>
+        <w:t xml:space="preserve"> j</w:t>
+      </w:r>
+      <w:r>
+        <w:rPr>
+          <w:rFonts w:ascii="Times New Roman" w:hAnsi="Times New Roman" w:eastAsia="Times New Roman" w:cs="Times New Roman"/>
+          <w:noProof w:val="0"/>
+          <w:sz w:val="22"/>
+          <w:szCs w:val="22"/>
+          <w:lang w:val="en-US"/>
+        </w:rPr>
+        <w:t xml:space="preserve"> </w:t>
+      </w:r>
+      <w:r>
+        <w:rPr>
+          <w:rFonts w:ascii="Times New Roman" w:hAnsi="Times New Roman" w:eastAsia="Times New Roman" w:cs="Times New Roman"/>
+          <w:noProof w:val="0"/>
+          <w:sz w:val="22"/>
+          <w:szCs w:val="22"/>
+          <w:lang w:val="en-US"/>
+        </w:rPr>
+        <w:t>values for eac</w:t>
+      </w:r>
+      <w:r>
+        <w:rPr>
+          <w:rFonts w:ascii="Times New Roman" w:hAnsi="Times New Roman" w:eastAsia="Times New Roman" w:cs="Times New Roman"/>
+          <w:noProof w:val="0"/>
+          <w:sz w:val="22"/>
+          <w:szCs w:val="22"/>
+          <w:lang w:val="en-US"/>
+        </w:rPr>
+        <w:t xml:space="preserve">h </w:t>
+      </w:r>
+      <w:r>
+        <w:rPr>
+          <w:rFonts w:ascii="Times New Roman" w:hAnsi="Times New Roman" w:eastAsia="Times New Roman" w:cs="Times New Roman"/>
+          <w:noProof w:val="0"/>
+          <w:sz w:val="22"/>
+          <w:szCs w:val="22"/>
+          <w:lang w:val="en-US"/>
+        </w:rPr>
+        <w:t>i</w:t>
+      </w:r>
+      <w:r>
+        <w:rPr>
+          <w:rFonts w:ascii="Times New Roman" w:hAnsi="Times New Roman" w:eastAsia="Times New Roman" w:cs="Times New Roman"/>
+          <w:noProof w:val="0"/>
+          <w:sz w:val="22"/>
+          <w:szCs w:val="22"/>
+          <w:lang w:val="en-US"/>
+        </w:rPr>
+        <w:t>, computing the correct byte offset (scaled by 16, since each array slot spans 4 elements × 4 bytes), storing</w:t>
+      </w:r>
+      <w:r>
+        <w:rPr>
+          <w:rFonts w:ascii="Times New Roman" w:hAnsi="Times New Roman" w:eastAsia="Times New Roman" w:cs="Times New Roman"/>
+          <w:noProof w:val="0"/>
+          <w:sz w:val="22"/>
+          <w:szCs w:val="22"/>
+          <w:lang w:val="en-US"/>
+        </w:rPr>
+        <w:t xml:space="preserve"> </w:t>
+      </w:r>
+      <w:r>
+        <w:rPr>
+          <w:rFonts w:ascii="Times New Roman" w:hAnsi="Times New Roman" w:eastAsia="Times New Roman" w:cs="Times New Roman"/>
+          <w:noProof w:val="0"/>
+          <w:sz w:val="22"/>
+          <w:szCs w:val="22"/>
+          <w:lang w:val="en-US"/>
+        </w:rPr>
+        <w:t>i</w:t>
+      </w:r>
+      <w:r>
+        <w:rPr>
+          <w:rFonts w:ascii="Times New Roman" w:hAnsi="Times New Roman" w:eastAsia="Times New Roman" w:cs="Times New Roman"/>
+          <w:noProof w:val="0"/>
+          <w:sz w:val="22"/>
+          <w:szCs w:val="22"/>
+          <w:lang w:val="en-US"/>
+        </w:rPr>
+        <w:t xml:space="preserve"> + j </w:t>
+      </w:r>
+      <w:r>
+        <w:rPr>
+          <w:rFonts w:ascii="Times New Roman" w:hAnsi="Times New Roman" w:eastAsia="Times New Roman" w:cs="Times New Roman"/>
+          <w:noProof w:val="0"/>
+          <w:sz w:val="22"/>
+          <w:szCs w:val="22"/>
+          <w:lang w:val="en-US"/>
+        </w:rPr>
+        <w:t>at that address with the outer loop incrementing</w:t>
+      </w:r>
+      <w:r>
+        <w:rPr>
+          <w:rFonts w:ascii="Times New Roman" w:hAnsi="Times New Roman" w:eastAsia="Times New Roman" w:cs="Times New Roman"/>
+          <w:noProof w:val="0"/>
+          <w:sz w:val="22"/>
+          <w:szCs w:val="22"/>
+          <w:lang w:val="en-US"/>
+        </w:rPr>
+        <w:t xml:space="preserve"> </w:t>
+      </w:r>
+      <w:r>
+        <w:rPr>
+          <w:rFonts w:ascii="Times New Roman" w:hAnsi="Times New Roman" w:eastAsia="Times New Roman" w:cs="Times New Roman"/>
+          <w:noProof w:val="0"/>
+          <w:sz w:val="22"/>
+          <w:szCs w:val="22"/>
+          <w:lang w:val="en-US"/>
+        </w:rPr>
+        <w:t>i</w:t>
+      </w:r>
+      <w:r>
+        <w:rPr>
+          <w:rFonts w:ascii="Times New Roman" w:hAnsi="Times New Roman" w:eastAsia="Times New Roman" w:cs="Times New Roman"/>
+          <w:noProof w:val="0"/>
+          <w:sz w:val="22"/>
+          <w:szCs w:val="22"/>
+          <w:lang w:val="en-US"/>
+        </w:rPr>
+        <w:t xml:space="preserve"> </w:t>
+      </w:r>
+      <w:r>
+        <w:rPr>
+          <w:rFonts w:ascii="Times New Roman" w:hAnsi="Times New Roman" w:eastAsia="Times New Roman" w:cs="Times New Roman"/>
+          <w:noProof w:val="0"/>
+          <w:sz w:val="22"/>
+          <w:szCs w:val="22"/>
+          <w:lang w:val="en-US"/>
+        </w:rPr>
+        <w:t>and repeating until both counters reach their limits.</w:t>
+      </w:r>
     </w:p>
     <w:p>
       <w:pPr>
@@ -16165,7 +16701,7 @@
       </w:pPr>
       <w:r>
         <w:drawing>
-          <wp:anchor distT="0" distB="0" distL="114300" distR="114300" simplePos="0" relativeHeight="251658240" behindDoc="0" locked="0" layoutInCell="1" allowOverlap="1" wp14:anchorId="63DE6E4A" wp14:editId="6DB305EF">
+          <wp:anchor distT="0" distB="0" distL="114300" distR="114300" simplePos="0" relativeHeight="251658240" behindDoc="0" locked="0" layoutInCell="1" allowOverlap="1" wp14:anchorId="63DE6E4A" wp14:editId="5560D910">
             <wp:simplePos x="0" y="0"/>
             <wp:positionH relativeFrom="column">
               <wp:posOffset>4343400</wp:posOffset>
@@ -16865,28 +17401,15 @@
         <w:ind w:right="0"/>
         <w:jc w:val="left"/>
       </w:pPr>
-    </w:p>
-    <w:p>
-      <w:pPr>
-        <w:pStyle w:val="Normal"/>
-        <w:tabs>
-          <w:tab w:val="center" w:leader="none" w:pos="4680"/>
-          <w:tab w:val="right" w:leader="none" w:pos="9360"/>
-        </w:tabs>
-        <w:bidi w:val="0"/>
-        <w:spacing w:before="0" w:beforeAutospacing="off" w:after="0" w:afterAutospacing="off" w:line="240" w:lineRule="auto"/>
-        <w:ind w:right="0"/>
-        <w:jc w:val="left"/>
-      </w:pPr>
       <w:r>
         <w:drawing>
-          <wp:anchor distT="0" distB="0" distL="114300" distR="114300" simplePos="0" relativeHeight="251658240" behindDoc="0" locked="0" layoutInCell="1" allowOverlap="1" wp14:anchorId="75DB9F8B" wp14:editId="2B1D7100">
+          <wp:anchor distT="0" distB="0" distL="114300" distR="114300" simplePos="0" relativeHeight="251658240" behindDoc="0" locked="0" layoutInCell="1" allowOverlap="1" wp14:editId="72A64523" wp14:anchorId="7199EFD8">
             <wp:simplePos x="0" y="0"/>
             <wp:positionH relativeFrom="column">
-              <wp:posOffset>361950</wp:posOffset>
+              <wp:posOffset>104775</wp:posOffset>
             </wp:positionH>
             <wp:positionV relativeFrom="paragraph">
-              <wp:posOffset>85725</wp:posOffset>
+              <wp:posOffset>28575</wp:posOffset>
             </wp:positionV>
             <wp:extent cx="4024054" cy="2231287"/>
             <wp:effectExtent l="0" t="0" r="0" b="0"/>
@@ -16939,7 +17462,6 @@
     <w:p>
       <w:pPr>
         <w:pStyle w:val="Normal"/>
-        <w:suppressLineNumbers w:val="0"/>
         <w:tabs>
           <w:tab w:val="center" w:leader="none" w:pos="4680"/>
           <w:tab w:val="right" w:leader="none" w:pos="9360"/>

</xml_diff>